<commit_message>
improve: change Cite style in pandoc docx
</commit_message>
<xml_diff>
--- a/lua/assets/mystyle.docx
+++ b/lua/assets/mystyle.docx
@@ -648,6 +648,13 @@
     <w:lsdException w:name="Placeholder Text" w:semiHidden="1"/>
     <w:lsdException w:name="Light Shading"/>
     <w:lsdException w:name="Light List"/>
+    <w:lsdException w:name="Light Grid"/>
+    <w:lsdException w:name="Medium Shading 1"/>
+    <w:lsdException w:name="Medium Shading 2"/>
+    <w:lsdException w:name="Medium List 1"/>
+    <w:lsdException w:name="Medium List 2"/>
+    <w:lsdException w:name="Medium Grid 1"/>
+    <w:lsdException w:name="Medium Grid 2"/>
     <w:lsdException w:name="Medium Grid 3"/>
     <w:lsdException w:name="Dark List"/>
     <w:lsdException w:name="Colorful Shading"/>
@@ -1354,14 +1361,14 @@
     <w:uiPriority w:val="9"/>
     <w:unhideWhenUsed/>
     <w:qFormat/>
-    <w:rsid w:val="001018E1"/>
-    <w:pPr>
-      <w:pBdr>
-        <w:left w:val="single" w:sz="4" w:space="4" w:color="auto"/>
-      </w:pBdr>
+    <w:rsid w:val="003F32C6"/>
+    <w:pPr>
       <w:spacing w:before="100" w:after="100"/>
-      <w:ind w:left="624" w:right="482" w:firstLine="0"/>
-    </w:pPr>
+      <w:ind w:left="624" w:right="624" w:firstLine="0"/>
+    </w:pPr>
+    <w:rPr>
+      <w:sz w:val="22"/>
+    </w:rPr>
   </w:style>
   <w:style w:type="paragraph" w:styleId="ab">
     <w:name w:val="footnote text"/>

</xml_diff>